<commit_message>
Use English labels and font metadata in release files
</commit_message>
<xml_diff>
--- a/demo_data/Amsterdam_Bijlmermeer_Urban_Renewal_Case/00_case/02_project_brief.docx
+++ b/demo_data/Amsterdam_Bijlmermeer_Urban_Renewal_Case/00_case/02_project_brief.docx
@@ -23996,9 +23996,9 @@
         <a:ea typeface=""/>
         <a:cs typeface=""/>
         <a:font script="Jpan" typeface="ＭＳ ゴシック"/>
-        <a:font script="Hang" typeface="맑은 고딕"/>
-        <a:font script="Hans" typeface="宋体"/>
-        <a:font script="Hant" typeface="新細明體"/>
+        <a:font script="Hang" typeface="Malgun Gothic"/>
+        <a:font script="Hans" typeface="SimSun"/>
+        <a:font script="Hant" typeface="PMingLiU"/>
         <a:font script="Arab" typeface="Times New Roman"/>
         <a:font script="Hebr" typeface="Times New Roman"/>
         <a:font script="Thai" typeface="Angsana New"/>
@@ -24030,10 +24030,10 @@
         <a:latin typeface="Cambria"/>
         <a:ea typeface=""/>
         <a:cs typeface=""/>
-        <a:font script="Jpan" typeface="ＭＳ 明朝"/>
-        <a:font script="Hang" typeface="맑은 고딕"/>
-        <a:font script="Hans" typeface="宋体"/>
-        <a:font script="Hant" typeface="新細明體"/>
+        <a:font script="Jpan" typeface="MS Mincho"/>
+        <a:font script="Hang" typeface="Malgun Gothic"/>
+        <a:font script="Hans" typeface="SimSun"/>
+        <a:font script="Hant" typeface="PMingLiU"/>
         <a:font script="Arab" typeface="Arial"/>
         <a:font script="Hebr" typeface="Arial"/>
         <a:font script="Thai" typeface="Cordia New"/>

</xml_diff>